<commit_message>
docs: remove Ishaan Snehal Parikh from Internship_Report author list
</commit_message>
<xml_diff>
--- a/Internship_Report.docx
+++ b/Internship_Report.docx
@@ -527,44 +527,6 @@
           <w:lang w:val="en-US"/>
         </w:rPr>
         <w:t>Arya Wadhwa</w:t>
-      </w:r>
-      <w:r>
-        <w:rPr>
-          <w:rFonts w:ascii="Times New Roman" w:hAnsi="Times New Roman" w:cs="Times New Roman"/>
-          <w:b/>
-          <w:bCs/>
-          <w:sz w:val="28"/>
-          <w:szCs w:val="28"/>
-          <w:lang w:val="en-US"/>
-        </w:rPr>
-        <w:tab/>
-        <w:t>R.V. College of Engineering, Bengaluru</w:t>
-      </w:r>
-    </w:p>
-    <w:p>
-      <w:pPr>
-        <w:tabs>
-          <w:tab w:val="left" w:pos="3722"/>
-        </w:tabs>
-        <w:ind w:left="194"/>
-        <w:rPr>
-          <w:rFonts w:ascii="Times New Roman" w:hAnsi="Times New Roman" w:cs="Times New Roman"/>
-          <w:b/>
-          <w:bCs/>
-          <w:sz w:val="28"/>
-          <w:szCs w:val="28"/>
-        </w:rPr>
-      </w:pPr>
-      <w:r>
-        <w:rPr>
-          <w:rFonts w:ascii="Times New Roman" w:hAnsi="Times New Roman" w:cs="Times New Roman"/>
-          <w:b/>
-          <w:bCs/>
-          <w:sz w:val="28"/>
-          <w:szCs w:val="28"/>
-          <w:lang w:val="en-US"/>
-        </w:rPr>
-        <w:t>Ishaan Snehal Parikh</w:t>
       </w:r>
       <w:r>
         <w:rPr>

</xml_diff>